<commit_message>
Update Encoding Decodiing and Encryption Decryption.docx
</commit_message>
<xml_diff>
--- a/Encoding Decodiing and Encryption Decryption.docx
+++ b/Encoding Decodiing and Encryption Decryption.docx
@@ -522,6 +522,9 @@
     </w:p>
     <w:p>
       <w:r>
+        <w:rPr>
+          <w:highlight w:val="magenta"/>
+        </w:rPr>
         <w:t>It is NOT security.</w:t>
       </w:r>
     </w:p>
@@ -692,12 +695,23 @@
       </w:r>
     </w:p>
     <w:p>
-      <w:r>
+      <w:pPr>
+        <w:rPr>
+          <w:highlight w:val="cyan"/>
+        </w:rPr>
+      </w:pPr>
+      <w:r>
+        <w:rPr>
+          <w:highlight w:val="cyan"/>
+        </w:rPr>
         <w:t>encoded in Base64.</w:t>
       </w:r>
     </w:p>
     <w:p>
       <w:r>
+        <w:rPr>
+          <w:highlight w:val="cyan"/>
+        </w:rPr>
         <w:t>Anyone can decode it easily.</w:t>
       </w:r>
     </w:p>
@@ -730,6 +744,9 @@
     </w:p>
     <w:p>
       <w:r>
+        <w:rPr>
+          <w:highlight w:val="cyan"/>
+        </w:rPr>
         <w:t>Base64 is not security.</w:t>
       </w:r>
     </w:p>
@@ -1092,13 +1109,23 @@
         <w:rPr>
           <w:b/>
           <w:bCs/>
+          <w:highlight w:val="magenta"/>
         </w:rPr>
         <w:t>3. Encryption</w:t>
       </w:r>
     </w:p>
     <w:p>
       <w:r>
-        <w:t>Encryption converts readable data into unreadable data using a mathematical algorithm and a key.</w:t>
+        <w:t xml:space="preserve">Encryption converts readable data into unreadable data using a </w:t>
+      </w:r>
+      <w:r>
+        <w:rPr>
+          <w:highlight w:val="cyan"/>
+        </w:rPr>
+        <w:t>mathematical algorithm and a key</w:t>
+      </w:r>
+      <w:r>
+        <w:t>.</w:t>
       </w:r>
     </w:p>
     <w:p>
@@ -1172,6 +1199,9 @@
     </w:p>
     <w:p>
       <w:r>
+        <w:rPr>
+          <w:highlight w:val="cyan"/>
+        </w:rPr>
         <w:t>Without the key, data is useless.</w:t>
       </w:r>
     </w:p>
@@ -1198,7 +1228,15 @@
       </w:r>
     </w:p>
     <w:p>
-      <w:r>
+      <w:pPr>
+        <w:rPr>
+          <w:highlight w:val="cyan"/>
+        </w:rPr>
+      </w:pPr>
+      <w:r>
+        <w:rPr>
+          <w:highlight w:val="cyan"/>
+        </w:rPr>
         <w:t>Encryption requires:</w:t>
       </w:r>
     </w:p>
@@ -1208,8 +1246,14 @@
           <w:ilvl w:val="0"/>
           <w:numId w:val="3"/>
         </w:numPr>
-      </w:pPr>
-      <w:r>
+        <w:rPr>
+          <w:highlight w:val="cyan"/>
+        </w:rPr>
+      </w:pPr>
+      <w:r>
+        <w:rPr>
+          <w:highlight w:val="cyan"/>
+        </w:rPr>
         <w:t xml:space="preserve">Algorithm </w:t>
       </w:r>
     </w:p>
@@ -1221,7 +1265,13 @@
         </w:numPr>
       </w:pPr>
       <w:r>
-        <w:t xml:space="preserve">Key </w:t>
+        <w:rPr>
+          <w:highlight w:val="cyan"/>
+        </w:rPr>
+        <w:t>Key</w:t>
+      </w:r>
+      <w:r>
+        <w:t xml:space="preserve"> </w:t>
       </w:r>
     </w:p>
     <w:p>
@@ -1258,12 +1308,16 @@
         <w:rPr>
           <w:b/>
           <w:bCs/>
+          <w:highlight w:val="magenta"/>
         </w:rPr>
         <w:t>A. Symmetric Encryption</w:t>
       </w:r>
     </w:p>
     <w:p>
       <w:r>
+        <w:rPr>
+          <w:highlight w:val="cyan"/>
+        </w:rPr>
         <w:t>Same key used for:</w:t>
       </w:r>
     </w:p>
@@ -1400,8 +1454,14 @@
           <w:p>
             <w:pPr>
               <w:spacing w:after="160" w:line="278" w:lineRule="auto"/>
-            </w:pPr>
-            <w:r>
+              <w:rPr>
+                <w:highlight w:val="cyan"/>
+              </w:rPr>
+            </w:pPr>
+            <w:r>
+              <w:rPr>
+                <w:highlight w:val="cyan"/>
+              </w:rPr>
               <w:t>AES</w:t>
             </w:r>
           </w:p>
@@ -1414,8 +1474,14 @@
           <w:p>
             <w:pPr>
               <w:spacing w:after="160" w:line="278" w:lineRule="auto"/>
-            </w:pPr>
-            <w:r>
+              <w:rPr>
+                <w:highlight w:val="cyan"/>
+              </w:rPr>
+            </w:pPr>
+            <w:r>
+              <w:rPr>
+                <w:highlight w:val="cyan"/>
+              </w:rPr>
               <w:t>Most common modern encryption</w:t>
             </w:r>
           </w:p>
@@ -1577,8 +1643,14 @@
           <w:ilvl w:val="0"/>
           <w:numId w:val="6"/>
         </w:numPr>
-      </w:pPr>
-      <w:r>
+        <w:rPr>
+          <w:highlight w:val="yellow"/>
+        </w:rPr>
+      </w:pPr>
+      <w:r>
+        <w:rPr>
+          <w:highlight w:val="yellow"/>
+        </w:rPr>
         <w:t xml:space="preserve">Key sharing problem </w:t>
       </w:r>
     </w:p>
@@ -1600,6 +1672,7 @@
         <w:rPr>
           <w:b/>
           <w:bCs/>
+          <w:highlight w:val="magenta"/>
         </w:rPr>
         <w:t>B. Asymmetric Encryption</w:t>
       </w:r>
@@ -1633,6 +1706,9 @@
     </w:p>
     <w:p>
       <w:r>
+        <w:rPr>
+          <w:highlight w:val="cyan"/>
+        </w:rPr>
         <w:t>Different keys for encryption and decryption.</w:t>
       </w:r>
     </w:p>
@@ -1661,9 +1737,15 @@
     </w:p>
     <w:p>
       <w:r>
+        <w:rPr>
+          <w:highlight w:val="green"/>
+        </w:rPr>
         <w:t>Public Key → Encrypt</w:t>
       </w:r>
       <w:r>
+        <w:rPr>
+          <w:highlight w:val="green"/>
+        </w:rPr>
         <w:br/>
         <w:t>Private Key → Decrypt</w:t>
       </w:r>
@@ -1925,6 +2007,7 @@
         <w:rPr>
           <w:b/>
           <w:bCs/>
+          <w:highlight w:val="magenta"/>
         </w:rPr>
         <w:t>4. Decryption</w:t>
       </w:r>
@@ -2021,6 +2104,7 @@
         <w:rPr>
           <w:b/>
           <w:bCs/>
+          <w:highlight w:val="magenta"/>
         </w:rPr>
         <w:lastRenderedPageBreak/>
         <w:t>5. Hashing</w:t>
@@ -2042,8 +2126,14 @@
           <w:ilvl w:val="0"/>
           <w:numId w:val="11"/>
         </w:numPr>
-      </w:pPr>
-      <w:r>
+        <w:rPr>
+          <w:highlight w:val="green"/>
+        </w:rPr>
+      </w:pPr>
+      <w:r>
+        <w:rPr>
+          <w:highlight w:val="green"/>
+        </w:rPr>
         <w:t xml:space="preserve">Converts data into fixed-size fingerprint </w:t>
       </w:r>
     </w:p>
@@ -2060,6 +2150,9 @@
     </w:p>
     <w:p>
       <w:r>
+        <w:rPr>
+          <w:highlight w:val="cyan"/>
+        </w:rPr>
         <w:t>Cannot normally be reversed.</w:t>
       </w:r>
     </w:p>
@@ -2129,6 +2222,9 @@
     </w:p>
     <w:p>
       <w:r>
+        <w:rPr>
+          <w:highlight w:val="cyan"/>
+        </w:rPr>
         <w:t>Same input always gives same hash.</w:t>
       </w:r>
     </w:p>
@@ -2225,6 +2321,7 @@
         <w:rPr>
           <w:b/>
           <w:bCs/>
+          <w:highlight w:val="magenta"/>
         </w:rPr>
         <w:t>Common Hash Algorithms</w:t>
       </w:r>

</xml_diff>